<commit_message>
Add Master Deluge Cloud Code modules to repository and Word document
</commit_message>
<xml_diff>
--- a/Hostel_Complaint_Management_System_Assignment.docx
+++ b/Hostel_Complaint_Management_System_Assignment.docx
@@ -1003,7 +1003,160 @@
     </w:p>
     <w:p>
       <w:r>
-        <w:t>The proposed solution architecture follows a standard 3-tier SaaS cloud structure with the entity field specifications outlined below:</w:t>
+        <w:t>The proposed solution architecture follows a standard 3-tier SaaS cloud structure. The cloud logic and automated workflows are implemented using Zoho Creator's native Deluge scripting language.</w:t>
+      </w:r>
+    </w:p>
+    <w:p>
+      <w:pPr>
+        <w:keepNext/>
+        <w:spacing w:before="200" w:after="60"/>
+      </w:pPr>
+      <w:r>
+        <w:rPr>
+          <w:rFonts w:ascii="Times New Roman" w:hAnsi="Times New Roman"/>
+          <w:b/>
+          <w:sz w:val="22"/>
+        </w:rPr>
+        <w:t>Cloud Deluge Scripting Implementation (Backend Code)</w:t>
+      </w:r>
+    </w:p>
+    <w:p>
+      <w:r>
+        <w:t>Below is the core Deluge cloud code deployed in Zoho Creator to handle automated ticket registration, ID generation, priority email dispatch, turnaround calculation, and REST API metrics:</w:t>
+      </w:r>
+    </w:p>
+    <w:tbl>
+      <w:tblPr>
+        <w:tblW w:type="auto" w:w="0"/>
+        <w:jc w:val="center"/>
+        <w:tblLook w:firstColumn="1" w:firstRow="1" w:lastColumn="0" w:lastRow="0" w:noHBand="0" w:noVBand="1" w:val="04A0"/>
+      </w:tblPr>
+      <w:tblGrid>
+        <w:gridCol w:w="9360"/>
+      </w:tblGrid>
+      <w:tr>
+        <w:tc>
+          <w:tcPr>
+            <w:tcW w:type="dxa" w:w="9360"/>
+            <w:shd w:fill="F8FAFC"/>
+            <w:tcMar>
+              <w:top w:w="80" w:type="dxa"/>
+              <w:bottom w:w="80" w:type="dxa"/>
+              <w:left w:w="120" w:type="dxa"/>
+              <w:right w:w="120" w:type="dxa"/>
+            </w:tcMar>
+          </w:tcPr>
+          <w:p>
+            <w:r>
+              <w:rPr>
+                <w:rFonts w:ascii="Courier New" w:hAnsi="Courier New"/>
+                <w:sz w:val="19"/>
+              </w:rPr>
+              <w:t>// 1. FORM ON SUCCESS WORKFLOW (Auto-ticket generation &amp; High Priority Email Alerts)</w:t>
+              <w:br/>
+              <w:t>void complaint_on_success_workflow()</w:t>
+              <w:br/>
+              <w:t>{</w:t>
+              <w:br/>
+              <w:t xml:space="preserve">    if(input.Status == null || input.Status == '') {</w:t>
+              <w:br/>
+              <w:t xml:space="preserve">        input.Status = 'Open';</w:t>
+              <w:br/>
+              <w:t xml:space="preserve">    }</w:t>
+              <w:br/>
+              <w:t xml:space="preserve">    if(input.Date_Submitted == null) {</w:t>
+              <w:br/>
+              <w:t xml:space="preserve">        input.Date_Submitted = zoho.currentdate;</w:t>
+              <w:br/>
+              <w:t xml:space="preserve">    }</w:t>
+              <w:br/>
+              <w:t xml:space="preserve">    if(input.Complaint_ID == null || input.Complaint_ID == '') {</w:t>
+              <w:br/>
+              <w:t xml:space="preserve">        input.Complaint_ID = 'CMP-' + zoho.currentdate.toString('yyyyMMdd') + '-' + input.ID.toString();</w:t>
+              <w:br/>
+              <w:t xml:space="preserve">    }</w:t>
+              <w:br/>
+              <w:t xml:space="preserve">    if(input.Priority == 'High') {</w:t>
+              <w:br/>
+              <w:t xml:space="preserve">        sendmail [</w:t>
+              <w:br/>
+              <w:t xml:space="preserve">            from : zoho.adminemail</w:t>
+              <w:br/>
+              <w:t xml:space="preserve">            to : 'warden.hostel@institution.edu'</w:t>
+              <w:br/>
+              <w:t xml:space="preserve">            subject : 'URGENT HIGH PRIORITY: ' + input.Complaint_Category + ' - ' + input.Hostel_Room_Number</w:t>
+              <w:br/>
+              <w:t xml:space="preserve">            message : 'Student ' + input.Student_Name + ' submitted urgent ticket for Room ' + input.Hostel_Room_Number</w:t>
+              <w:br/>
+              <w:t xml:space="preserve">        ];</w:t>
+              <w:br/>
+              <w:t xml:space="preserve">    }</w:t>
+              <w:br/>
+              <w:t>}</w:t>
+              <w:br/>
+              <w:br/>
+              <w:t>// 2. STATUS UPDATE AUTOMATION &amp; TURNAROUND CALCULATION</w:t>
+              <w:br/>
+              <w:t>void complaint_on_status_update()</w:t>
+              <w:br/>
+              <w:t>{</w:t>
+              <w:br/>
+              <w:t xml:space="preserve">    if(input.Status == 'Resolved') {</w:t>
+              <w:br/>
+              <w:t xml:space="preserve">        input.Resolution_Date = zoho.currentdate;</w:t>
+              <w:br/>
+              <w:t xml:space="preserve">        if(input.Date_Submitted != null) {</w:t>
+              <w:br/>
+              <w:t xml:space="preserve">            input.Turnaround_Days = daysBetween(input.Date_Submitted, input.Resolution_Date);</w:t>
+              <w:br/>
+              <w:t xml:space="preserve">        }</w:t>
+              <w:br/>
+              <w:t xml:space="preserve">    }</w:t>
+              <w:br/>
+              <w:t>}</w:t>
+              <w:br/>
+              <w:br/>
+              <w:t>// 3. REST API METRICS JSON ENDPOINT</w:t>
+              <w:br/>
+              <w:t>string get_complaint_summary_json()</w:t>
+              <w:br/>
+              <w:t>{</w:t>
+              <w:br/>
+              <w:t xml:space="preserve">    open_cnt = Hostel_Complaint_Record[Status == 'Open'].count();</w:t>
+              <w:br/>
+              <w:t xml:space="preserve">    res_cnt = Hostel_Complaint_Record[Status == 'Resolved'].count();</w:t>
+              <w:br/>
+              <w:t xml:space="preserve">    res_map = Map();</w:t>
+              <w:br/>
+              <w:t xml:space="preserve">    res_map.put('open_tickets', open_cnt);</w:t>
+              <w:br/>
+              <w:t xml:space="preserve">    res_map.put('resolved_tickets', res_cnt);</w:t>
+              <w:br/>
+              <w:t xml:space="preserve">    return res_map.toString();</w:t>
+              <w:br/>
+              <w:t>}</w:t>
+            </w:r>
+          </w:p>
+        </w:tc>
+      </w:tr>
+    </w:tbl>
+    <w:p>
+      <w:pPr>
+        <w:spacing w:after="120"/>
+      </w:pPr>
+    </w:p>
+    <w:p>
+      <w:pPr>
+        <w:keepNext/>
+        <w:spacing w:before="200" w:after="60"/>
+      </w:pPr>
+      <w:r>
+        <w:rPr>
+          <w:rFonts w:ascii="Times New Roman" w:hAnsi="Times New Roman"/>
+          <w:b/>
+          <w:sz w:val="22"/>
+        </w:rPr>
+        <w:t>Data Schema / Entity Field Specifications</w:t>
       </w:r>
     </w:p>
     <w:tbl>

</xml_diff>